<commit_message>
ajustes no template e criacao de template sigiloso
</commit_message>
<xml_diff>
--- a/docs/template-base-estilos.docx
+++ b/docs/template-base-estilos.docx
@@ -353,9 +353,6 @@
 <w:endnotes xmlns:wpc="http://schemas.microsoft.com/office/word/2010/wordprocessingCanvas" xmlns:cx="http://schemas.microsoft.com/office/drawing/2014/chartex" xmlns:cx1="http://schemas.microsoft.com/office/drawing/2015/9/8/chartex" xmlns:cx2="http://schemas.microsoft.com/office/drawing/2015/10/21/chartex" xmlns:cx3="http://schemas.microsoft.com/office/drawing/2016/5/9/chartex" xmlns:cx4="http://schemas.microsoft.com/office/drawing/2016/5/10/chartex" xmlns:cx5="http://schemas.microsoft.com/office/drawing/2016/5/11/chartex" xmlns:cx6="http://schemas.microsoft.com/office/drawing/2016/5/12/chartex" xmlns:cx7="http://schemas.microsoft.com/office/drawing/2016/5/13/chartex" xmlns:cx8="http://schemas.microsoft.com/office/drawing/2016/5/14/chartex" xmlns:mc="http://schemas.openxmlformats.org/markup-compatibility/2006" xmlns:aink="http://schemas.microsoft.com/office/drawing/2016/ink" xmlns:am3d="http://schemas.microsoft.com/office/drawing/2017/model3d" xmlns:o="urn:schemas-microsoft-com:office:office" xmlns:oel="http://schemas.microsoft.com/office/2019/extlst" xmlns:r="http://schemas.openxmlformats.org/officeDocument/2006/relationships" xmlns:m="http://schemas.openxmlformats.org/officeDocument/2006/math" xmlns:v="urn:schemas-microsoft-com:vml" xmlns:wp14="http://schemas.microsoft.com/office/word/2010/wordprocessingDrawing" xmlns:wp="http://schemas.openxmlformats.org/drawingml/2006/wordprocessingDrawing" xmlns:w10="urn:schemas-microsoft-com:office:word" xmlns:w="http://schemas.openxmlformats.org/wordprocessingml/2006/main" xmlns:w14="http://schemas.microsoft.com/office/word/2010/wordml" xmlns:w15="http://schemas.microsoft.com/office/word/2012/wordml" xmlns:w16cex="http://schemas.microsoft.com/office/word/2018/wordml/cex" xmlns:w16cid="http://schemas.microsoft.com/office/word/2016/wordml/cid" xmlns:w16="http://schemas.microsoft.com/office/word/2018/wordml" xmlns:w16du="http://schemas.microsoft.com/office/word/2023/wordml/word16du" xmlns:w16sdtdh="http://schemas.microsoft.com/office/word/2020/wordml/sdtdatahash" xmlns:w16sdtfl="http://schemas.microsoft.com/office/word/2024/wordml/sdtformatlock" xmlns:w16se="http://schemas.microsoft.com/office/word/2015/wordml/symex" xmlns:wpg="http://schemas.microsoft.com/office/word/2010/wordprocessingGroup" xmlns:wpi="http://schemas.microsoft.com/office/word/2010/wordprocessingInk" xmlns:wne="http://schemas.microsoft.com/office/word/2006/wordml" xmlns:wps="http://schemas.microsoft.com/office/word/2010/wordprocessingShape" mc:Ignorable="w14 w15 w16se w16cid w16 w16cex w16sdtdh w16sdtfl w16du wp14">
   <w:endnote w:type="separator" w:id="-1">
     <w:p>
-      <w:pPr>
-        <w:spacing w:after="0"/>
-      </w:pPr>
       <w:r>
         <w:separator/>
       </w:r>
@@ -363,9 +360,6 @@
   </w:endnote>
   <w:endnote w:type="continuationSeparator" w:id="0">
     <w:p>
-      <w:pPr>
-        <w:spacing w:after="0"/>
-      </w:pPr>
       <w:r>
         <w:continuationSeparator/>
       </w:r>
@@ -424,14 +418,12 @@
           <v:stroke joinstyle="miter"/>
           <v:path gradientshapeok="t" o:connecttype="rect"/>
         </v:shapetype>
-        <v:shape id="Caixa de Texto 3" o:spid="_x0000_s2053" type="#_x0000_t202" style="position:absolute;margin-left:50.1pt;margin-top:.65pt;width:298.6pt;height:35.8pt;z-index:251664384;visibility:visible;mso-wrap-style:square;mso-width-percent:0;mso-height-percent:0;mso-wrap-distance-left:2.85pt;mso-wrap-distance-top:0;mso-wrap-distance-right:9pt;mso-wrap-distance-bottom:0;mso-position-horizontal:absolute;mso-position-horizontal-relative:text;mso-position-vertical:absolute;mso-position-vertical-relative:text;mso-width-percent:0;mso-height-percent:0;mso-width-relative:page;mso-height-relative:page;v-text-anchor:top" o:gfxdata="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" strokecolor="white">
+        <v:shape id="Caixa de Texto 3" o:spid="_x0000_s2053" type="#_x0000_t202" style="position:absolute;left:0;text-align:left;margin-left:50.1pt;margin-top:.65pt;width:298.6pt;height:35.8pt;z-index:251664384;visibility:visible;mso-wrap-style:square;mso-width-percent:0;mso-height-percent:0;mso-wrap-distance-left:2.85pt;mso-wrap-distance-top:0;mso-wrap-distance-right:9pt;mso-wrap-distance-bottom:0;mso-position-horizontal:absolute;mso-position-horizontal-relative:text;mso-position-vertical:absolute;mso-position-vertical-relative:text;mso-width-percent:0;mso-height-percent:0;mso-width-relative:page;mso-height-relative:page;v-text-anchor:top" o:gfxdata="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" strokecolor="white">
           <v:textbox inset="1.3mm,.2mm">
             <w:txbxContent>
               <w:p>
                 <w:pPr>
-                  <w:spacing w:after="0"/>
                   <w:rPr>
-                    <w:rFonts w:ascii="Arial" w:hAnsi="Arial"/>
                     <w:b/>
                     <w:sz w:val="14"/>
                     <w:szCs w:val="18"/>
@@ -439,7 +431,6 @@
                 </w:pPr>
                 <w:r>
                   <w:rPr>
-                    <w:rFonts w:ascii="Arial" w:hAnsi="Arial"/>
                     <w:b/>
                     <w:sz w:val="14"/>
                     <w:szCs w:val="18"/>
@@ -449,16 +440,13 @@
               </w:p>
               <w:p>
                 <w:pPr>
-                  <w:spacing w:after="0"/>
                   <w:rPr>
-                    <w:rFonts w:ascii="Arial" w:hAnsi="Arial"/>
                     <w:sz w:val="14"/>
                     <w:szCs w:val="18"/>
                   </w:rPr>
                 </w:pPr>
                 <w:r>
                   <w:rPr>
-                    <w:rFonts w:ascii="Arial" w:hAnsi="Arial"/>
                     <w:sz w:val="14"/>
                     <w:szCs w:val="18"/>
                   </w:rPr>
@@ -467,16 +455,13 @@
               </w:p>
               <w:p>
                 <w:pPr>
-                  <w:spacing w:after="0"/>
                   <w:rPr>
-                    <w:rFonts w:ascii="Arial" w:hAnsi="Arial"/>
                     <w:sz w:val="14"/>
                     <w:szCs w:val="18"/>
                   </w:rPr>
                 </w:pPr>
                 <w:r>
                   <w:rPr>
-                    <w:rFonts w:ascii="Arial" w:hAnsi="Arial"/>
                     <w:sz w:val="14"/>
                     <w:szCs w:val="18"/>
                   </w:rPr>
@@ -485,16 +470,13 @@
               </w:p>
               <w:p>
                 <w:pPr>
-                  <w:spacing w:after="0"/>
                   <w:rPr>
-                    <w:rFonts w:ascii="Arial" w:hAnsi="Arial"/>
                     <w:sz w:val="14"/>
                     <w:szCs w:val="18"/>
                   </w:rPr>
                 </w:pPr>
                 <w:r>
                   <w:rPr>
-                    <w:rFonts w:ascii="Arial" w:hAnsi="Arial"/>
                     <w:sz w:val="14"/>
                     <w:szCs w:val="18"/>
                   </w:rPr>
@@ -584,7 +566,7 @@
         <w:szCs w:val="20"/>
       </w:rPr>
       <w:pict w14:anchorId="23726EF9">
-        <v:line id="Conector reto 2" o:spid="_x0000_s2052" style="position:absolute;z-index:251665408;visibility:visible;mso-wrap-style:square;mso-width-percent:0;mso-height-percent:0;mso-wrap-distance-left:9pt;mso-wrap-distance-top:-3e-5mm;mso-wrap-distance-right:9pt;mso-wrap-distance-bottom:-3e-5mm;mso-position-horizontal:absolute;mso-position-horizontal-relative:text;mso-position-vertical:absolute;mso-position-vertical-relative:text;mso-width-percent:0;mso-height-percent:0;mso-width-relative:page;mso-height-relative:page" from="0,4.65pt" to="440pt,4.65pt" o:gfxdata="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"/>
+        <v:line id="Conector reto 2" o:spid="_x0000_s2052" style="position:absolute;left:0;text-align:left;z-index:251665408;visibility:visible;mso-wrap-style:square;mso-width-percent:0;mso-height-percent:0;mso-wrap-distance-left:9pt;mso-wrap-distance-top:-3e-5mm;mso-wrap-distance-right:9pt;mso-wrap-distance-bottom:-3e-5mm;mso-position-horizontal:absolute;mso-position-horizontal-relative:text;mso-position-vertical:absolute;mso-position-vertical-relative:text;mso-width-percent:0;mso-height-percent:0;mso-width-relative:page;mso-height-relative:page" from="0,4.65pt" to="440pt,4.65pt" o:gfxdata="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"/>
       </w:pict>
     </w:r>
   </w:p>
@@ -969,7 +951,15 @@
   <w:style w:type="paragraph" w:default="1" w:styleId="Normal">
     <w:name w:val="Normal"/>
     <w:qFormat/>
-    <w:rsid w:val="00215569"/>
+    <w:rsid w:val="00AA1CF3"/>
+    <w:pPr>
+      <w:spacing w:after="0" w:line="360" w:lineRule="auto"/>
+      <w:jc w:val="both"/>
+    </w:pPr>
+    <w:rPr>
+      <w:rFonts w:ascii="Arial" w:hAnsi="Arial"/>
+      <w:sz w:val="22"/>
+    </w:rPr>
   </w:style>
   <w:style w:type="paragraph" w:styleId="Ttulo1">
     <w:name w:val="heading 1"/>
@@ -982,8 +972,7 @@
     <w:pPr>
       <w:keepNext/>
       <w:keepLines/>
-      <w:spacing w:before="120" w:after="240" w:line="360" w:lineRule="auto"/>
-      <w:jc w:val="both"/>
+      <w:spacing w:before="120" w:after="240"/>
       <w:outlineLvl w:val="0"/>
     </w:pPr>
     <w:rPr>
@@ -1007,7 +996,7 @@
     <w:pPr>
       <w:keepNext/>
       <w:keepLines/>
-      <w:spacing w:before="120" w:after="120" w:line="360" w:lineRule="auto"/>
+      <w:spacing w:before="120" w:after="120"/>
       <w:outlineLvl w:val="1"/>
     </w:pPr>
     <w:rPr>
@@ -1031,7 +1020,7 @@
     <w:pPr>
       <w:keepNext/>
       <w:keepLines/>
-      <w:spacing w:before="120" w:after="120" w:line="360" w:lineRule="auto"/>
+      <w:spacing w:before="120" w:after="120"/>
       <w:outlineLvl w:val="2"/>
     </w:pPr>
     <w:rPr>
@@ -1055,12 +1044,11 @@
     <w:pPr>
       <w:keepNext/>
       <w:keepLines/>
-      <w:spacing w:before="60" w:after="60" w:line="360" w:lineRule="auto"/>
-      <w:jc w:val="both"/>
+      <w:spacing w:before="60" w:after="60"/>
       <w:outlineLvl w:val="3"/>
     </w:pPr>
     <w:rPr>
-      <w:rFonts w:ascii="Arial" w:eastAsiaTheme="majorEastAsia" w:hAnsi="Arial" w:cstheme="majorBidi"/>
+      <w:rFonts w:eastAsiaTheme="majorEastAsia" w:cstheme="majorBidi"/>
       <w:b/>
       <w:iCs/>
       <w:color w:val="000000" w:themeColor="text1"/>
@@ -1100,7 +1088,7 @@
     <w:pPr>
       <w:keepNext/>
       <w:keepLines/>
-      <w:spacing w:before="40" w:after="0"/>
+      <w:spacing w:before="40"/>
       <w:outlineLvl w:val="5"/>
     </w:pPr>
     <w:rPr>
@@ -1123,7 +1111,7 @@
     <w:pPr>
       <w:keepNext/>
       <w:keepLines/>
-      <w:spacing w:before="40" w:after="0"/>
+      <w:spacing w:before="40"/>
       <w:outlineLvl w:val="6"/>
     </w:pPr>
     <w:rPr>
@@ -1144,7 +1132,6 @@
     <w:pPr>
       <w:keepNext/>
       <w:keepLines/>
-      <w:spacing w:after="0"/>
       <w:outlineLvl w:val="7"/>
     </w:pPr>
     <w:rPr>
@@ -1167,7 +1154,6 @@
     <w:pPr>
       <w:keepNext/>
       <w:keepLines/>
-      <w:spacing w:after="0"/>
       <w:outlineLvl w:val="8"/>
     </w:pPr>
     <w:rPr>
@@ -1208,14 +1194,8 @@
     <w:qFormat/>
     <w:rsid w:val="008F0F00"/>
     <w:pPr>
-      <w:spacing w:after="0" w:line="360" w:lineRule="auto"/>
       <w:ind w:firstLine="720"/>
-      <w:jc w:val="both"/>
-    </w:pPr>
-    <w:rPr>
-      <w:rFonts w:ascii="Arial" w:hAnsi="Arial"/>
-      <w:sz w:val="22"/>
-    </w:rPr>
+    </w:pPr>
   </w:style>
   <w:style w:type="paragraph" w:customStyle="1" w:styleId="FirstParagraph">
     <w:name w:val="First Paragraph"/>
@@ -1245,9 +1225,25 @@
     <w:qFormat/>
     <w:rsid w:val="00CF400E"/>
     <w:pPr>
-      <w:spacing w:before="5600" w:after="0" w:line="360" w:lineRule="auto"/>
+      <w:spacing w:before="5600"/>
       <w:jc w:val="center"/>
     </w:pPr>
+    <w:rPr>
+      <w:rFonts w:eastAsiaTheme="majorEastAsia" w:cstheme="majorBidi"/>
+      <w:b/>
+      <w:color w:val="2F5496"/>
+      <w:spacing w:val="-10"/>
+      <w:kern w:val="28"/>
+      <w:sz w:val="44"/>
+      <w:szCs w:val="56"/>
+    </w:rPr>
+  </w:style>
+  <w:style w:type="character" w:customStyle="1" w:styleId="TtuloChar">
+    <w:name w:val="Título Char"/>
+    <w:basedOn w:val="Fontepargpadro"/>
+    <w:link w:val="Ttulo"/>
+    <w:uiPriority w:val="10"/>
+    <w:rsid w:val="00CF400E"/>
     <w:rPr>
       <w:rFonts w:ascii="Arial" w:eastAsiaTheme="majorEastAsia" w:hAnsi="Arial" w:cstheme="majorBidi"/>
       <w:b/>
@@ -1258,22 +1254,6 @@
       <w:szCs w:val="56"/>
     </w:rPr>
   </w:style>
-  <w:style w:type="character" w:customStyle="1" w:styleId="TtuloChar">
-    <w:name w:val="Título Char"/>
-    <w:basedOn w:val="Fontepargpadro"/>
-    <w:link w:val="Ttulo"/>
-    <w:uiPriority w:val="10"/>
-    <w:rsid w:val="00CF400E"/>
-    <w:rPr>
-      <w:rFonts w:ascii="Arial" w:eastAsiaTheme="majorEastAsia" w:hAnsi="Arial" w:cstheme="majorBidi"/>
-      <w:b/>
-      <w:color w:val="2F5496"/>
-      <w:spacing w:val="-10"/>
-      <w:kern w:val="28"/>
-      <w:sz w:val="44"/>
-      <w:szCs w:val="56"/>
-    </w:rPr>
-  </w:style>
   <w:style w:type="paragraph" w:styleId="Subttulo">
     <w:name w:val="Subtitle"/>
     <w:basedOn w:val="Ttulo"/>
@@ -1339,7 +1319,7 @@
     <w:pPr>
       <w:keepNext/>
       <w:keepLines/>
-      <w:spacing w:before="300" w:after="0"/>
+      <w:spacing w:before="300"/>
       <w:jc w:val="center"/>
     </w:pPr>
     <w:rPr>
@@ -1507,13 +1487,11 @@
     <w:uiPriority w:val="9"/>
     <w:unhideWhenUsed/>
     <w:qFormat/>
-    <w:rsid w:val="008F0F00"/>
-    <w:pPr>
-      <w:spacing w:after="60"/>
-      <w:jc w:val="both"/>
-    </w:pPr>
-    <w:rPr>
-      <w:rFonts w:ascii="Arial" w:hAnsi="Arial"/>
+    <w:rsid w:val="00694D60"/>
+    <w:pPr>
+      <w:spacing w:after="60" w:line="240" w:lineRule="auto"/>
+    </w:pPr>
+    <w:rPr>
       <w:sz w:val="18"/>
     </w:rPr>
   </w:style>
@@ -1595,7 +1573,6 @@
     <w:pPr>
       <w:keepNext/>
       <w:keepLines/>
-      <w:spacing w:after="0"/>
     </w:pPr>
     <w:rPr>
       <w:b/>
@@ -1628,7 +1605,6 @@
       <w:jc w:val="center"/>
     </w:pPr>
     <w:rPr>
-      <w:rFonts w:ascii="Arial" w:hAnsi="Arial"/>
       <w:b/>
       <w:i w:val="0"/>
       <w:color w:val="4472C4"/>
@@ -1646,7 +1622,6 @@
       <w:jc w:val="center"/>
     </w:pPr>
     <w:rPr>
-      <w:rFonts w:ascii="Arial" w:hAnsi="Arial"/>
       <w:b/>
       <w:i w:val="0"/>
       <w:color w:val="4472C4"/>
@@ -1664,13 +1639,9 @@
     <w:rsid w:val="00085256"/>
     <w:pPr>
       <w:keepNext/>
-      <w:spacing w:before="120" w:after="0" w:line="360" w:lineRule="auto"/>
+      <w:spacing w:before="120"/>
       <w:jc w:val="center"/>
     </w:pPr>
-    <w:rPr>
-      <w:rFonts w:ascii="Arial" w:hAnsi="Arial"/>
-      <w:sz w:val="22"/>
-    </w:rPr>
   </w:style>
   <w:style w:type="character" w:customStyle="1" w:styleId="LegendaChar">
     <w:name w:val="Legenda Char"/>
@@ -1733,7 +1704,6 @@
       <w:jc w:val="center"/>
     </w:pPr>
     <w:rPr>
-      <w:rFonts w:ascii="Arial" w:hAnsi="Arial"/>
       <w:color w:val="000000" w:themeColor="text1"/>
       <w:sz w:val="16"/>
     </w:rPr>
@@ -1749,7 +1719,6 @@
         <w:tab w:val="center" w:pos="4252"/>
         <w:tab w:val="right" w:pos="8504"/>
       </w:tabs>
-      <w:spacing w:after="0"/>
     </w:pPr>
   </w:style>
   <w:style w:type="character" w:customStyle="1" w:styleId="CabealhoChar">
@@ -1769,7 +1738,6 @@
         <w:tab w:val="center" w:pos="4252"/>
         <w:tab w:val="right" w:pos="8504"/>
       </w:tabs>
-      <w:spacing w:after="0"/>
     </w:pPr>
   </w:style>
   <w:style w:type="character" w:customStyle="1" w:styleId="RodapChar">

</xml_diff>

<commit_message>
feat: add fallback JSON parsing for special columns in report generation
</commit_message>
<xml_diff>
--- a/docs/template-base-estilos.docx
+++ b/docs/template-base-estilos.docx
@@ -353,9 +353,6 @@
 <w:endnotes xmlns:wpc="http://schemas.microsoft.com/office/word/2010/wordprocessingCanvas" xmlns:cx="http://schemas.microsoft.com/office/drawing/2014/chartex" xmlns:cx1="http://schemas.microsoft.com/office/drawing/2015/9/8/chartex" xmlns:cx2="http://schemas.microsoft.com/office/drawing/2015/10/21/chartex" xmlns:cx3="http://schemas.microsoft.com/office/drawing/2016/5/9/chartex" xmlns:cx4="http://schemas.microsoft.com/office/drawing/2016/5/10/chartex" xmlns:cx5="http://schemas.microsoft.com/office/drawing/2016/5/11/chartex" xmlns:cx6="http://schemas.microsoft.com/office/drawing/2016/5/12/chartex" xmlns:cx7="http://schemas.microsoft.com/office/drawing/2016/5/13/chartex" xmlns:cx8="http://schemas.microsoft.com/office/drawing/2016/5/14/chartex" xmlns:mc="http://schemas.openxmlformats.org/markup-compatibility/2006" xmlns:aink="http://schemas.microsoft.com/office/drawing/2016/ink" xmlns:am3d="http://schemas.microsoft.com/office/drawing/2017/model3d" xmlns:o="urn:schemas-microsoft-com:office:office" xmlns:oel="http://schemas.microsoft.com/office/2019/extlst" xmlns:r="http://schemas.openxmlformats.org/officeDocument/2006/relationships" xmlns:m="http://schemas.openxmlformats.org/officeDocument/2006/math" xmlns:v="urn:schemas-microsoft-com:vml" xmlns:wp14="http://schemas.microsoft.com/office/word/2010/wordprocessingDrawing" xmlns:wp="http://schemas.openxmlformats.org/drawingml/2006/wordprocessingDrawing" xmlns:w10="urn:schemas-microsoft-com:office:word" xmlns:w="http://schemas.openxmlformats.org/wordprocessingml/2006/main" xmlns:w14="http://schemas.microsoft.com/office/word/2010/wordml" xmlns:w15="http://schemas.microsoft.com/office/word/2012/wordml" xmlns:w16cex="http://schemas.microsoft.com/office/word/2018/wordml/cex" xmlns:w16cid="http://schemas.microsoft.com/office/word/2016/wordml/cid" xmlns:w16="http://schemas.microsoft.com/office/word/2018/wordml" xmlns:w16du="http://schemas.microsoft.com/office/word/2023/wordml/word16du" xmlns:w16sdtdh="http://schemas.microsoft.com/office/word/2020/wordml/sdtdatahash" xmlns:w16sdtfl="http://schemas.microsoft.com/office/word/2024/wordml/sdtformatlock" xmlns:w16se="http://schemas.microsoft.com/office/word/2015/wordml/symex" xmlns:wpg="http://schemas.microsoft.com/office/word/2010/wordprocessingGroup" xmlns:wpi="http://schemas.microsoft.com/office/word/2010/wordprocessingInk" xmlns:wne="http://schemas.microsoft.com/office/word/2006/wordml" xmlns:wps="http://schemas.microsoft.com/office/word/2010/wordprocessingShape" mc:Ignorable="w14 w15 w16se w16cid w16 w16cex w16sdtdh w16sdtfl w16du wp14">
   <w:endnote w:type="separator" w:id="-1">
     <w:p>
-      <w:pPr>
-        <w:spacing w:after="0"/>
-      </w:pPr>
       <w:r>
         <w:separator/>
       </w:r>
@@ -363,9 +360,6 @@
   </w:endnote>
   <w:endnote w:type="continuationSeparator" w:id="0">
     <w:p>
-      <w:pPr>
-        <w:spacing w:after="0"/>
-      </w:pPr>
       <w:r>
         <w:continuationSeparator/>
       </w:r>
@@ -424,79 +418,75 @@
           <v:stroke joinstyle="miter"/>
           <v:path gradientshapeok="t" o:connecttype="rect"/>
         </v:shapetype>
-        <v:shape id="Caixa de Texto 3" o:spid="_x0000_s2053" type="#_x0000_t202" style="position:absolute;margin-left:50.1pt;margin-top:.65pt;width:298.6pt;height:35.8pt;z-index:251664384;visibility:visible;mso-wrap-style:square;mso-width-percent:0;mso-height-percent:0;mso-wrap-distance-left:2.85pt;mso-wrap-distance-top:0;mso-wrap-distance-right:9pt;mso-wrap-distance-bottom:0;mso-position-horizontal:absolute;mso-position-horizontal-relative:text;mso-position-vertical:absolute;mso-position-vertical-relative:text;mso-width-percent:0;mso-height-percent:0;mso-width-relative:page;mso-height-relative:page;v-text-anchor:top" o:gfxdata="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" strokecolor="white">
+        <v:shape id="Caixa de Texto 3" o:spid="_x0000_s2053" type="#_x0000_t202" style="position:absolute;left:0;text-align:left;margin-left:50.1pt;margin-top:.65pt;width:298.6pt;height:35.8pt;z-index:251664384;visibility:visible;mso-wrap-style:square;mso-width-percent:0;mso-height-percent:0;mso-wrap-distance-left:2.85pt;mso-wrap-distance-top:0;mso-wrap-distance-right:9pt;mso-wrap-distance-bottom:0;mso-position-horizontal:absolute;mso-position-horizontal-relative:text;mso-position-vertical:absolute;mso-position-vertical-relative:text;mso-width-percent:0;mso-height-percent:0;mso-width-relative:page;mso-height-relative:page;v-text-anchor:top" o:gfxdata="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" strokecolor="white">
           <v:textbox inset="1.3mm,.2mm">
             <w:txbxContent>
               <w:p>
                 <w:pPr>
-                  <w:spacing w:after="0"/>
                   <w:rPr>
-                    <w:rFonts w:ascii="Arial" w:hAnsi="Arial"/>
                     <w:b/>
                     <w:sz w:val="14"/>
                     <w:szCs w:val="18"/>
+                    <w:lang w:val="pt-BR"/>
                   </w:rPr>
                 </w:pPr>
                 <w:r>
                   <w:rPr>
-                    <w:rFonts w:ascii="Arial" w:hAnsi="Arial"/>
                     <w:b/>
                     <w:sz w:val="14"/>
                     <w:szCs w:val="18"/>
+                    <w:lang w:val="pt-BR"/>
                   </w:rPr>
                   <w:t>TRIBUNAL DE CONTAS DO ESTADO DO RIO DE JANEIRO</w:t>
                 </w:r>
               </w:p>
               <w:p>
                 <w:pPr>
-                  <w:spacing w:after="0"/>
                   <w:rPr>
-                    <w:rFonts w:ascii="Arial" w:hAnsi="Arial"/>
                     <w:sz w:val="14"/>
                     <w:szCs w:val="18"/>
+                    <w:lang w:val="pt-BR"/>
                   </w:rPr>
                 </w:pPr>
                 <w:r>
                   <w:rPr>
-                    <w:rFonts w:ascii="Arial" w:hAnsi="Arial"/>
                     <w:sz w:val="14"/>
                     <w:szCs w:val="18"/>
+                    <w:lang w:val="pt-BR"/>
                   </w:rPr>
                   <w:t>SECRETARIA-GERAL DE CONTROLE EXTERNO</w:t>
                 </w:r>
               </w:p>
               <w:p>
                 <w:pPr>
-                  <w:spacing w:after="0"/>
                   <w:rPr>
-                    <w:rFonts w:ascii="Arial" w:hAnsi="Arial"/>
                     <w:sz w:val="14"/>
                     <w:szCs w:val="18"/>
+                    <w:lang w:val="pt-BR"/>
                   </w:rPr>
                 </w:pPr>
                 <w:r>
                   <w:rPr>
-                    <w:rFonts w:ascii="Arial" w:hAnsi="Arial"/>
                     <w:sz w:val="14"/>
                     <w:szCs w:val="18"/>
+                    <w:lang w:val="pt-BR"/>
                   </w:rPr>
                   <w:t xml:space="preserve">SUBSECRETARIA DE CONTROLE DE POLÍTICAS DE CIDADANIA </w:t>
                 </w:r>
               </w:p>
               <w:p>
                 <w:pPr>
-                  <w:spacing w:after="0"/>
                   <w:rPr>
-                    <w:rFonts w:ascii="Arial" w:hAnsi="Arial"/>
                     <w:sz w:val="14"/>
                     <w:szCs w:val="18"/>
+                    <w:lang w:val="pt-BR"/>
                   </w:rPr>
                 </w:pPr>
                 <w:r>
                   <w:rPr>
-                    <w:rFonts w:ascii="Arial" w:hAnsi="Arial"/>
                     <w:sz w:val="14"/>
                     <w:szCs w:val="18"/>
+                    <w:lang w:val="pt-BR"/>
                   </w:rPr>
                   <w:t>COORDENADORIA DE AUDITORIA EM POLÍTICAS DE TECNOLOGIA DA INFORMAÇÃO</w:t>
                 </w:r>
@@ -584,7 +574,7 @@
         <w:szCs w:val="20"/>
       </w:rPr>
       <w:pict w14:anchorId="23726EF9">
-        <v:line id="Conector reto 2" o:spid="_x0000_s2052" style="position:absolute;z-index:251665408;visibility:visible;mso-wrap-style:square;mso-width-percent:0;mso-height-percent:0;mso-wrap-distance-left:9pt;mso-wrap-distance-top:-3e-5mm;mso-wrap-distance-right:9pt;mso-wrap-distance-bottom:-3e-5mm;mso-position-horizontal:absolute;mso-position-horizontal-relative:text;mso-position-vertical:absolute;mso-position-vertical-relative:text;mso-width-percent:0;mso-height-percent:0;mso-width-relative:page;mso-height-relative:page" from="0,4.65pt" to="440pt,4.65pt" o:gfxdata="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"/>
+        <v:line id="Conector reto 2" o:spid="_x0000_s2052" style="position:absolute;left:0;text-align:left;z-index:251665408;visibility:visible;mso-wrap-style:square;mso-width-percent:0;mso-height-percent:0;mso-wrap-distance-left:9pt;mso-wrap-distance-top:-3e-5mm;mso-wrap-distance-right:9pt;mso-wrap-distance-bottom:-3e-5mm;mso-position-horizontal:absolute;mso-position-horizontal-relative:text;mso-position-vertical:absolute;mso-position-vertical-relative:text;mso-width-percent:0;mso-height-percent:0;mso-width-relative:page;mso-height-relative:page" from="0,4.65pt" to="440pt,4.65pt" o:gfxdata="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"/>
       </w:pict>
     </w:r>
   </w:p>
@@ -969,7 +959,15 @@
   <w:style w:type="paragraph" w:default="1" w:styleId="Normal">
     <w:name w:val="Normal"/>
     <w:qFormat/>
-    <w:rsid w:val="00215569"/>
+    <w:rsid w:val="009D5600"/>
+    <w:pPr>
+      <w:spacing w:after="0" w:line="360" w:lineRule="auto"/>
+      <w:jc w:val="both"/>
+    </w:pPr>
+    <w:rPr>
+      <w:rFonts w:ascii="Arial" w:hAnsi="Arial"/>
+      <w:sz w:val="22"/>
+    </w:rPr>
   </w:style>
   <w:style w:type="paragraph" w:styleId="Ttulo1">
     <w:name w:val="heading 1"/>
@@ -982,8 +980,7 @@
     <w:pPr>
       <w:keepNext/>
       <w:keepLines/>
-      <w:spacing w:before="120" w:after="240" w:line="360" w:lineRule="auto"/>
-      <w:jc w:val="both"/>
+      <w:spacing w:before="120" w:after="240"/>
       <w:outlineLvl w:val="0"/>
     </w:pPr>
     <w:rPr>
@@ -1007,7 +1004,7 @@
     <w:pPr>
       <w:keepNext/>
       <w:keepLines/>
-      <w:spacing w:before="120" w:after="120" w:line="360" w:lineRule="auto"/>
+      <w:spacing w:before="120" w:after="120"/>
       <w:outlineLvl w:val="1"/>
     </w:pPr>
     <w:rPr>
@@ -1031,7 +1028,7 @@
     <w:pPr>
       <w:keepNext/>
       <w:keepLines/>
-      <w:spacing w:before="120" w:after="120" w:line="360" w:lineRule="auto"/>
+      <w:spacing w:before="120" w:after="120"/>
       <w:outlineLvl w:val="2"/>
     </w:pPr>
     <w:rPr>
@@ -1055,12 +1052,11 @@
     <w:pPr>
       <w:keepNext/>
       <w:keepLines/>
-      <w:spacing w:before="60" w:after="60" w:line="360" w:lineRule="auto"/>
-      <w:jc w:val="both"/>
+      <w:spacing w:before="60" w:after="60"/>
       <w:outlineLvl w:val="3"/>
     </w:pPr>
     <w:rPr>
-      <w:rFonts w:ascii="Arial" w:eastAsiaTheme="majorEastAsia" w:hAnsi="Arial" w:cstheme="majorBidi"/>
+      <w:rFonts w:eastAsiaTheme="majorEastAsia" w:cstheme="majorBidi"/>
       <w:b/>
       <w:iCs/>
       <w:color w:val="000000" w:themeColor="text1"/>
@@ -1100,7 +1096,7 @@
     <w:pPr>
       <w:keepNext/>
       <w:keepLines/>
-      <w:spacing w:before="40" w:after="0"/>
+      <w:spacing w:before="40"/>
       <w:outlineLvl w:val="5"/>
     </w:pPr>
     <w:rPr>
@@ -1123,7 +1119,7 @@
     <w:pPr>
       <w:keepNext/>
       <w:keepLines/>
-      <w:spacing w:before="40" w:after="0"/>
+      <w:spacing w:before="40"/>
       <w:outlineLvl w:val="6"/>
     </w:pPr>
     <w:rPr>
@@ -1144,7 +1140,6 @@
     <w:pPr>
       <w:keepNext/>
       <w:keepLines/>
-      <w:spacing w:after="0"/>
       <w:outlineLvl w:val="7"/>
     </w:pPr>
     <w:rPr>
@@ -1167,7 +1162,6 @@
     <w:pPr>
       <w:keepNext/>
       <w:keepLines/>
-      <w:spacing w:after="0"/>
       <w:outlineLvl w:val="8"/>
     </w:pPr>
     <w:rPr>
@@ -1208,14 +1202,8 @@
     <w:qFormat/>
     <w:rsid w:val="008F0F00"/>
     <w:pPr>
-      <w:spacing w:after="0" w:line="360" w:lineRule="auto"/>
       <w:ind w:firstLine="720"/>
-      <w:jc w:val="both"/>
-    </w:pPr>
-    <w:rPr>
-      <w:rFonts w:ascii="Arial" w:hAnsi="Arial"/>
-      <w:sz w:val="22"/>
-    </w:rPr>
+    </w:pPr>
   </w:style>
   <w:style w:type="paragraph" w:customStyle="1" w:styleId="FirstParagraph">
     <w:name w:val="First Paragraph"/>
@@ -1223,6 +1211,7 @@
     <w:next w:val="Corpodetexto"/>
     <w:autoRedefine/>
     <w:qFormat/>
+    <w:rsid w:val="005871F2"/>
   </w:style>
   <w:style w:type="paragraph" w:customStyle="1" w:styleId="Compact">
     <w:name w:val="Compact"/>
@@ -1245,9 +1234,25 @@
     <w:qFormat/>
     <w:rsid w:val="00CF400E"/>
     <w:pPr>
-      <w:spacing w:before="5600" w:after="0" w:line="360" w:lineRule="auto"/>
+      <w:spacing w:before="5600"/>
       <w:jc w:val="center"/>
     </w:pPr>
+    <w:rPr>
+      <w:rFonts w:eastAsiaTheme="majorEastAsia" w:cstheme="majorBidi"/>
+      <w:b/>
+      <w:color w:val="2F5496"/>
+      <w:spacing w:val="-10"/>
+      <w:kern w:val="28"/>
+      <w:sz w:val="44"/>
+      <w:szCs w:val="56"/>
+    </w:rPr>
+  </w:style>
+  <w:style w:type="character" w:customStyle="1" w:styleId="TtuloChar">
+    <w:name w:val="Título Char"/>
+    <w:basedOn w:val="Fontepargpadro"/>
+    <w:link w:val="Ttulo"/>
+    <w:uiPriority w:val="10"/>
+    <w:rsid w:val="00CF400E"/>
     <w:rPr>
       <w:rFonts w:ascii="Arial" w:eastAsiaTheme="majorEastAsia" w:hAnsi="Arial" w:cstheme="majorBidi"/>
       <w:b/>
@@ -1258,22 +1263,6 @@
       <w:szCs w:val="56"/>
     </w:rPr>
   </w:style>
-  <w:style w:type="character" w:customStyle="1" w:styleId="TtuloChar">
-    <w:name w:val="Título Char"/>
-    <w:basedOn w:val="Fontepargpadro"/>
-    <w:link w:val="Ttulo"/>
-    <w:uiPriority w:val="10"/>
-    <w:rsid w:val="00CF400E"/>
-    <w:rPr>
-      <w:rFonts w:ascii="Arial" w:eastAsiaTheme="majorEastAsia" w:hAnsi="Arial" w:cstheme="majorBidi"/>
-      <w:b/>
-      <w:color w:val="2F5496"/>
-      <w:spacing w:val="-10"/>
-      <w:kern w:val="28"/>
-      <w:sz w:val="44"/>
-      <w:szCs w:val="56"/>
-    </w:rPr>
-  </w:style>
   <w:style w:type="paragraph" w:styleId="Subttulo">
     <w:name w:val="Subtitle"/>
     <w:basedOn w:val="Ttulo"/>
@@ -1339,7 +1328,7 @@
     <w:pPr>
       <w:keepNext/>
       <w:keepLines/>
-      <w:spacing w:before="300" w:after="0"/>
+      <w:spacing w:before="300"/>
       <w:jc w:val="center"/>
     </w:pPr>
     <w:rPr>
@@ -1507,13 +1496,11 @@
     <w:uiPriority w:val="9"/>
     <w:unhideWhenUsed/>
     <w:qFormat/>
-    <w:rsid w:val="008F0F00"/>
-    <w:pPr>
-      <w:spacing w:after="60"/>
-      <w:jc w:val="both"/>
-    </w:pPr>
-    <w:rPr>
-      <w:rFonts w:ascii="Arial" w:hAnsi="Arial"/>
+    <w:rsid w:val="006A3D13"/>
+    <w:pPr>
+      <w:spacing w:after="60" w:line="240" w:lineRule="auto"/>
+    </w:pPr>
+    <w:rPr>
       <w:sz w:val="18"/>
     </w:rPr>
   </w:style>
@@ -1595,7 +1582,6 @@
     <w:pPr>
       <w:keepNext/>
       <w:keepLines/>
-      <w:spacing w:after="0"/>
     </w:pPr>
     <w:rPr>
       <w:b/>
@@ -1628,7 +1614,6 @@
       <w:jc w:val="center"/>
     </w:pPr>
     <w:rPr>
-      <w:rFonts w:ascii="Arial" w:hAnsi="Arial"/>
       <w:b/>
       <w:i w:val="0"/>
       <w:color w:val="4472C4"/>
@@ -1646,7 +1631,6 @@
       <w:jc w:val="center"/>
     </w:pPr>
     <w:rPr>
-      <w:rFonts w:ascii="Arial" w:hAnsi="Arial"/>
       <w:b/>
       <w:i w:val="0"/>
       <w:color w:val="4472C4"/>
@@ -1664,13 +1648,9 @@
     <w:rsid w:val="00085256"/>
     <w:pPr>
       <w:keepNext/>
-      <w:spacing w:before="120" w:after="0" w:line="360" w:lineRule="auto"/>
+      <w:spacing w:before="120"/>
       <w:jc w:val="center"/>
     </w:pPr>
-    <w:rPr>
-      <w:rFonts w:ascii="Arial" w:hAnsi="Arial"/>
-      <w:sz w:val="22"/>
-    </w:rPr>
   </w:style>
   <w:style w:type="character" w:customStyle="1" w:styleId="LegendaChar">
     <w:name w:val="Legenda Char"/>
@@ -1733,7 +1713,6 @@
       <w:jc w:val="center"/>
     </w:pPr>
     <w:rPr>
-      <w:rFonts w:ascii="Arial" w:hAnsi="Arial"/>
       <w:color w:val="000000" w:themeColor="text1"/>
       <w:sz w:val="16"/>
     </w:rPr>
@@ -1749,7 +1728,6 @@
         <w:tab w:val="center" w:pos="4252"/>
         <w:tab w:val="right" w:pos="8504"/>
       </w:tabs>
-      <w:spacing w:after="0"/>
     </w:pPr>
   </w:style>
   <w:style w:type="character" w:customStyle="1" w:styleId="CabealhoChar">
@@ -1769,7 +1747,6 @@
         <w:tab w:val="center" w:pos="4252"/>
         <w:tab w:val="right" w:pos="8504"/>
       </w:tabs>
-      <w:spacing w:after="0"/>
     </w:pPr>
   </w:style>
   <w:style w:type="character" w:customStyle="1" w:styleId="RodapChar">

</xml_diff>